<commit_message>
adds 0724 dept of labor federa trust
</commit_message>
<xml_diff>
--- a/data/FY2025 Files/FY25 New Data Items.docx
+++ b/data/FY2025 Files/FY25 New Data Items.docx
@@ -14,8 +14,21 @@
       </w:r>
     </w:p>
     <w:p>
-      <w:r>
-        <w:t xml:space="preserve">Code_cleaning.qmd file was ran to identify any changes in funds, sources, agencies, organizations, etc. from past years. Screenshot below is one example of differences found for the revenue sources and source names. </w:t>
+      <w:proofErr w:type="spellStart"/>
+      <w:r>
+        <w:t>Code_cleaning.qmd</w:t>
+      </w:r>
+      <w:proofErr w:type="spellEnd"/>
+      <w:r>
+        <w:t xml:space="preserve"> file was </w:t>
+      </w:r>
+      <w:proofErr w:type="gramStart"/>
+      <w:r>
+        <w:t>ran</w:t>
+      </w:r>
+      <w:proofErr w:type="gramEnd"/>
+      <w:r>
+        <w:t xml:space="preserve"> to identify any changes in funds, sources, agencies, organizations, etc. from past years. Screenshot below is one example of differences found for the revenue sources and source names. </w:t>
       </w:r>
     </w:p>
     <w:p>
@@ -73,7 +86,31 @@
         <w:spacing w:after="0"/>
       </w:pPr>
       <w:r>
-        <w:t xml:space="preserve">Go to comptrollers website (ilinoiscomptroller.gov &gt; Financial Reports &amp; Data&gt; and then Expenditures or Revenues depending on what you are doing) and search each revenue source to see the category assigned by the comptroller. Add that variable to rev_type_name_COMPTROLLER in ioc_sources.xlsx. </w:t>
+        <w:t xml:space="preserve">Go to </w:t>
+      </w:r>
+      <w:proofErr w:type="gramStart"/>
+      <w:r>
+        <w:t>comptrollers</w:t>
+      </w:r>
+      <w:proofErr w:type="gramEnd"/>
+      <w:r>
+        <w:t xml:space="preserve"> website (ilinoiscomptroller.gov &gt; Financial Reports &amp; Data&gt; and then Expenditures or Revenues depending on what you are doing) and </w:t>
+      </w:r>
+      <w:proofErr w:type="gramStart"/>
+      <w:r>
+        <w:t>search</w:t>
+      </w:r>
+      <w:proofErr w:type="gramEnd"/>
+      <w:r>
+        <w:t xml:space="preserve"> each revenue source to see the category assigned by the comptroller. Add that variable to </w:t>
+      </w:r>
+      <w:proofErr w:type="spellStart"/>
+      <w:r>
+        <w:t>rev_type_name_COMPTROLLER</w:t>
+      </w:r>
+      <w:proofErr w:type="spellEnd"/>
+      <w:r>
+        <w:t xml:space="preserve"> in ioc_sources.xlsx. </w:t>
       </w:r>
     </w:p>
     <w:p>
@@ -86,7 +123,31 @@
         <w:spacing w:after="0"/>
       </w:pPr>
       <w:r>
-        <w:t>For each rev source identified by code_cleaning.qmd, I searched the source number on the comptrollers website to see what the name and type of source it was. Also used best judgement for names were just slightly different to determine if they were not new revenue sources.</w:t>
+        <w:t xml:space="preserve">For each rev source identified by </w:t>
+      </w:r>
+      <w:proofErr w:type="spellStart"/>
+      <w:r>
+        <w:t>code_cleaning.qmd</w:t>
+      </w:r>
+      <w:proofErr w:type="spellEnd"/>
+      <w:r>
+        <w:t xml:space="preserve">, I </w:t>
+      </w:r>
+      <w:proofErr w:type="gramStart"/>
+      <w:r>
+        <w:t>searched</w:t>
+      </w:r>
+      <w:proofErr w:type="gramEnd"/>
+      <w:r>
+        <w:t xml:space="preserve"> the source number on the </w:t>
+      </w:r>
+      <w:proofErr w:type="gramStart"/>
+      <w:r>
+        <w:t>comptrollers</w:t>
+      </w:r>
+      <w:proofErr w:type="gramEnd"/>
+      <w:r>
+        <w:t xml:space="preserve"> website to see what the name and type of source it was. Also used best judgement for names were just slightly different to determine if they were not new revenue sources.</w:t>
       </w:r>
     </w:p>
     <w:p>
@@ -185,6 +246,7 @@
                 <w:szCs w:val="20"/>
               </w:rPr>
             </w:pPr>
+            <w:proofErr w:type="spellStart"/>
             <w:r>
               <w:rPr>
                 <w:b/>
@@ -194,6 +256,7 @@
               </w:rPr>
               <w:t>Source_name</w:t>
             </w:r>
+            <w:proofErr w:type="spellEnd"/>
           </w:p>
         </w:tc>
         <w:tc>
@@ -276,6 +339,7 @@
                 <w:highlight w:val="green"/>
               </w:rPr>
             </w:pPr>
+            <w:proofErr w:type="spellStart"/>
             <w:r>
               <w:rPr>
                 <w:b/>
@@ -286,6 +350,7 @@
               </w:rPr>
               <w:t>Rev_type_number</w:t>
             </w:r>
+            <w:proofErr w:type="spellEnd"/>
           </w:p>
         </w:tc>
         <w:tc>
@@ -304,6 +369,7 @@
                 <w:highlight w:val="green"/>
               </w:rPr>
             </w:pPr>
+            <w:proofErr w:type="spellStart"/>
             <w:r>
               <w:rPr>
                 <w:b/>
@@ -314,6 +380,7 @@
               </w:rPr>
               <w:t>Rev_type_name</w:t>
             </w:r>
+            <w:proofErr w:type="spellEnd"/>
           </w:p>
         </w:tc>
       </w:tr>
@@ -3067,11 +3134,29 @@
         <w:t xml:space="preserve"> </w:t>
       </w:r>
       <w:r>
-        <w:t xml:space="preserve">variables in ioc_sources file!! Rev_type_name, </w:t>
-      </w:r>
+        <w:t xml:space="preserve">variables in </w:t>
+      </w:r>
+      <w:proofErr w:type="spellStart"/>
+      <w:r>
+        <w:t>ioc_sources</w:t>
+      </w:r>
+      <w:proofErr w:type="spellEnd"/>
+      <w:r>
+        <w:t xml:space="preserve"> file!! </w:t>
+      </w:r>
+      <w:proofErr w:type="spellStart"/>
+      <w:r>
+        <w:t>Rev_type_name</w:t>
+      </w:r>
+      <w:proofErr w:type="spellEnd"/>
+      <w:r>
+        <w:t xml:space="preserve">, </w:t>
+      </w:r>
+      <w:proofErr w:type="spellStart"/>
       <w:r>
         <w:t>rev_type_name_COMPTROLLER</w:t>
       </w:r>
+      <w:proofErr w:type="spellEnd"/>
       <w:r>
         <w:t xml:space="preserve"> </w:t>
       </w:r>
@@ -3108,7 +3193,15 @@
     </w:p>
     <w:p>
       <w:r>
-        <w:t xml:space="preserve">Search fund and find out informatin about it. IOC has fund search options: </w:t>
+        <w:t xml:space="preserve">Search </w:t>
+      </w:r>
+      <w:proofErr w:type="gramStart"/>
+      <w:r>
+        <w:t>fund</w:t>
+      </w:r>
+      <w:proofErr w:type="gramEnd"/>
+      <w:r>
+        <w:t xml:space="preserve"> and find out informatin about it. IOC has fund search options: </w:t>
       </w:r>
       <w:hyperlink r:id="rId6" w:history="1">
         <w:r>
@@ -3194,9 +3287,11 @@
             <w:vAlign w:val="center"/>
           </w:tcPr>
           <w:p>
+            <w:proofErr w:type="spellStart"/>
             <w:r>
               <w:t>Fund_name</w:t>
             </w:r>
+            <w:proofErr w:type="spellEnd"/>
           </w:p>
         </w:tc>
         <w:tc>
@@ -3350,12 +3445,28 @@
               <w:t xml:space="preserve">Exclude from expenditures probably just a holding fund. </w:t>
             </w:r>
             <w:r>
-              <w:t xml:space="preserve"> --- look into more still</w:t>
-            </w:r>
-          </w:p>
-          <w:p>
-            <w:r>
-              <w:t>Look into on revenue side.</w:t>
+              <w:t xml:space="preserve"> --- </w:t>
+            </w:r>
+            <w:proofErr w:type="gramStart"/>
+            <w:r>
+              <w:t>look into</w:t>
+            </w:r>
+            <w:proofErr w:type="gramEnd"/>
+            <w:r>
+              <w:t xml:space="preserve"> more still</w:t>
+            </w:r>
+          </w:p>
+          <w:p>
+            <w:r>
+              <w:t xml:space="preserve">Look into </w:t>
+            </w:r>
+            <w:proofErr w:type="gramStart"/>
+            <w:r>
+              <w:t>on</w:t>
+            </w:r>
+            <w:proofErr w:type="gramEnd"/>
+            <w:r>
+              <w:t xml:space="preserve"> revenue side.</w:t>
             </w:r>
           </w:p>
         </w:tc>
@@ -3740,6 +3851,7 @@
             <w:hideMark/>
           </w:tcPr>
           <w:p>
+            <w:proofErr w:type="gramStart"/>
             <w:r>
               <w:t>REUSED-3</w:t>
             </w:r>
@@ -3749,6 +3861,7 @@
               </w:rPr>
               <w:t>rd</w:t>
             </w:r>
+            <w:proofErr w:type="gramEnd"/>
             <w:r>
               <w:t xml:space="preserve"> time! </w:t>
             </w:r>
@@ -5403,11 +5516,130 @@
           </w:p>
         </w:tc>
       </w:tr>
+      <w:tr>
+        <w:trPr>
+          <w:trHeight w:val="446"/>
+          <w:tblCellSpacing w:w="0" w:type="dxa"/>
+        </w:trPr>
+        <w:tc>
+          <w:tcPr>
+            <w:tcW w:w="990" w:type="dxa"/>
+            <w:noWrap/>
+            <w:tcMar>
+              <w:top w:w="30" w:type="dxa"/>
+              <w:left w:w="90" w:type="dxa"/>
+              <w:bottom w:w="30" w:type="dxa"/>
+              <w:right w:w="90" w:type="dxa"/>
+            </w:tcMar>
+            <w:vAlign w:val="center"/>
+          </w:tcPr>
+          <w:p>
+            <w:pPr>
+              <w:rPr>
+                <w:strike/>
+              </w:rPr>
+            </w:pPr>
+            <w:r>
+              <w:rPr>
+                <w:strike/>
+              </w:rPr>
+              <w:t>0724</w:t>
+            </w:r>
+          </w:p>
+        </w:tc>
+        <w:tc>
+          <w:tcPr>
+            <w:tcW w:w="3960" w:type="dxa"/>
+            <w:noWrap/>
+            <w:tcMar>
+              <w:top w:w="30" w:type="dxa"/>
+              <w:left w:w="90" w:type="dxa"/>
+              <w:bottom w:w="30" w:type="dxa"/>
+              <w:right w:w="90" w:type="dxa"/>
+            </w:tcMar>
+            <w:vAlign w:val="center"/>
+          </w:tcPr>
+          <w:p>
+            <w:pPr>
+              <w:rPr>
+                <w:strike/>
+              </w:rPr>
+            </w:pPr>
+            <w:r>
+              <w:rPr>
+                <w:strike/>
+              </w:rPr>
+              <w:t>DEPT OF LABOR FEDERAL TRUST</w:t>
+            </w:r>
+          </w:p>
+        </w:tc>
+        <w:tc>
+          <w:tcPr>
+            <w:tcW w:w="2250" w:type="dxa"/>
+            <w:noWrap/>
+            <w:tcMar>
+              <w:top w:w="30" w:type="dxa"/>
+              <w:left w:w="90" w:type="dxa"/>
+              <w:bottom w:w="30" w:type="dxa"/>
+              <w:right w:w="90" w:type="dxa"/>
+            </w:tcMar>
+            <w:vAlign w:val="center"/>
+          </w:tcPr>
+          <w:p>
+            <w:pPr>
+              <w:rPr>
+                <w:strike/>
+              </w:rPr>
+            </w:pPr>
+          </w:p>
+        </w:tc>
+        <w:tc>
+          <w:tcPr>
+            <w:tcW w:w="2340" w:type="dxa"/>
+            <w:noWrap/>
+            <w:tcMar>
+              <w:top w:w="30" w:type="dxa"/>
+              <w:left w:w="90" w:type="dxa"/>
+              <w:bottom w:w="30" w:type="dxa"/>
+              <w:right w:w="90" w:type="dxa"/>
+            </w:tcMar>
+            <w:vAlign w:val="center"/>
+          </w:tcPr>
+          <w:p>
+            <w:pPr>
+              <w:jc w:val="right"/>
+              <w:rPr>
+                <w:strike/>
+              </w:rPr>
+            </w:pPr>
+          </w:p>
+        </w:tc>
+        <w:tc>
+          <w:tcPr>
+            <w:tcW w:w="1620" w:type="dxa"/>
+          </w:tcPr>
+          <w:p>
+            <w:pPr>
+              <w:rPr>
+                <w:strike/>
+              </w:rPr>
+            </w:pPr>
+          </w:p>
+        </w:tc>
+      </w:tr>
     </w:tbl>
     <w:p/>
     <w:p>
       <w:r>
-        <w:t>Go look up fund on IOC website to find other variables that need to be filled in in the funds_ab_in.xlsx file. Fill in fund category</w:t>
+        <w:t xml:space="preserve">Go look up </w:t>
+      </w:r>
+      <w:proofErr w:type="gramStart"/>
+      <w:r>
+        <w:t>fund</w:t>
+      </w:r>
+      <w:proofErr w:type="gramEnd"/>
+      <w:r>
+        <w:t xml:space="preserve"> on IOC website to find other variables that need to be filled in in the funds_ab_in.xlsx file. Fill in fund category</w:t>
       </w:r>
       <w:r>
         <w:t xml:space="preserve"> and</w:t>
@@ -5425,7 +5657,6 @@
     <w:p/>
     <w:p>
       <w:r>
-        <w:lastRenderedPageBreak/>
         <w:t>New Fund Information</w:t>
       </w:r>
     </w:p>
@@ -5557,7 +5788,15 @@
         </w:numPr>
       </w:pPr>
       <w:r>
-        <w:t>Not used yet. Info not on comptrollers website as of 7/17/2025</w:t>
+        <w:t xml:space="preserve">Not used yet. Info not on </w:t>
+      </w:r>
+      <w:proofErr w:type="gramStart"/>
+      <w:r>
+        <w:t>comptrollers</w:t>
+      </w:r>
+      <w:proofErr w:type="gramEnd"/>
+      <w:r>
+        <w:t xml:space="preserve"> website as of 7/17/2025</w:t>
       </w:r>
     </w:p>
     <w:p>
@@ -5573,7 +5812,15 @@
         </w:numPr>
       </w:pPr>
       <w:r>
-        <w:t>Not used yet. Info not on comptrollers website as of 7/17/2025</w:t>
+        <w:t xml:space="preserve">Not used yet. Info not on </w:t>
+      </w:r>
+      <w:proofErr w:type="gramStart"/>
+      <w:r>
+        <w:t>comptrollers</w:t>
+      </w:r>
+      <w:proofErr w:type="gramEnd"/>
+      <w:r>
+        <w:t xml:space="preserve"> website as of 7/17/2025</w:t>
       </w:r>
     </w:p>
     <w:p>
@@ -5589,7 +5836,15 @@
         </w:numPr>
       </w:pPr>
       <w:r>
-        <w:t>Not used yet. Info not on comptrollers website as of 7/17/2025</w:t>
+        <w:t xml:space="preserve">Not used yet. Info not on </w:t>
+      </w:r>
+      <w:proofErr w:type="gramStart"/>
+      <w:r>
+        <w:t>comptrollers</w:t>
+      </w:r>
+      <w:proofErr w:type="gramEnd"/>
+      <w:r>
+        <w:t xml:space="preserve"> website as of 7/17/2025</w:t>
       </w:r>
     </w:p>
     <w:p>
@@ -5605,11 +5860,20 @@
         </w:numPr>
       </w:pPr>
       <w:r>
-        <w:t>Not used yet. Info not on comptrollers website as of 7/17/2025</w:t>
+        <w:t xml:space="preserve">Not used yet. Info not on </w:t>
+      </w:r>
+      <w:proofErr w:type="gramStart"/>
+      <w:r>
+        <w:t>comptrollers</w:t>
+      </w:r>
+      <w:proofErr w:type="gramEnd"/>
+      <w:r>
+        <w:t xml:space="preserve"> website as of 7/17/2025</w:t>
       </w:r>
     </w:p>
     <w:p>
       <w:r>
+        <w:lastRenderedPageBreak/>
         <w:t>Water Resources</w:t>
       </w:r>
     </w:p>
@@ -5621,12 +5885,19 @@
         </w:numPr>
       </w:pPr>
       <w:r>
-        <w:t>Not used yet. Info not on comptrollers website as of 7/17/2025</w:t>
+        <w:t xml:space="preserve">Not used yet. Info not on </w:t>
+      </w:r>
+      <w:proofErr w:type="gramStart"/>
+      <w:r>
+        <w:t>comptrollers</w:t>
+      </w:r>
+      <w:proofErr w:type="gramEnd"/>
+      <w:r>
+        <w:t xml:space="preserve"> website as of 7/17/2025</w:t>
       </w:r>
     </w:p>
     <w:p>
       <w:r>
-        <w:lastRenderedPageBreak/>
         <w:t>Health Equity and Access</w:t>
       </w:r>
       <w:r>
@@ -5641,7 +5912,15 @@
         </w:numPr>
       </w:pPr>
       <w:r>
-        <w:t>Not used yet. Info not on comptrollers website as of 7/17/2025</w:t>
+        <w:t xml:space="preserve">Not used yet. Info not on </w:t>
+      </w:r>
+      <w:proofErr w:type="gramStart"/>
+      <w:r>
+        <w:t>comptrollers</w:t>
+      </w:r>
+      <w:proofErr w:type="gramEnd"/>
+      <w:r>
+        <w:t xml:space="preserve"> website as of 7/17/2025</w:t>
       </w:r>
     </w:p>
     <w:p/>
@@ -5870,6 +6149,7 @@
           <w:b/>
           <w:bCs/>
         </w:rPr>
+        <w:lastRenderedPageBreak/>
         <w:t>ADMINISTERING AGENCY:</w:t>
       </w:r>
       <w:r>
@@ -5899,11 +6179,7 @@
       </w:r>
       <w:r>
         <w:br/>
-        <w:t xml:space="preserve">IS CREATED AS A SPECIAL FUND IN THE STATE TREASURY. ALL MONEYS IN THE </w:t>
-      </w:r>
-      <w:r>
-        <w:lastRenderedPageBreak/>
-        <w:t xml:space="preserve">FUND SHALL BE APPROPRIATED TO THE DEPARTMENT OF HEALTHCARE AND FAMILY SERVICES AND EXPENDED </w:t>
+        <w:t xml:space="preserve">IS CREATED AS A SPECIAL FUND IN THE STATE TREASURY. ALL MONEYS IN THE FUND SHALL BE APPROPRIATED TO THE DEPARTMENT OF HEALTHCARE AND FAMILY SERVICES AND EXPENDED </w:t>
       </w:r>
       <w:r>
         <w:rPr>
@@ -5912,7 +6188,15 @@
         <w:t>EXCLUSIVELY FOR THE MEDICAL DEBT RELIEF PILOT PROGRAM TO PROVIDE GRANT FUNDING TO A NONPROFIT MEDICAL DEBT RELIEF COORDINATOR</w:t>
       </w:r>
       <w:r>
-        <w:t xml:space="preserve"> TO BE USED TO DISCHARGE THE MDICAL DEBT OF ELIGIBLE RESIDENTS AS DEFINED IN THE MEDICAL DEBT RELIEF ACT. BASED ON A BUDGET APPROVED BY DEPARTMENT, THE GRANT FUNDING MAY ALSO BE USED FOR ANY ADMIN SERVICES PROVIDED BY THE NONPROFIT MEDICAL DEBT REL COORD TO DISCHRGE MED DEBT</w:t>
+        <w:t xml:space="preserve"> TO BE USED TO DISCHARGE THE MDICAL DEBT OF ELIGIBLE RESIDENTS AS DEFINED IN THE MEDICAL DEBT RELIEF ACT. BASED ON A BUDGET APPROVED BY DEPARTMENT, THE GRANT </w:t>
+      </w:r>
+      <w:proofErr w:type="gramStart"/>
+      <w:r>
+        <w:t>FUNDING MAY</w:t>
+      </w:r>
+      <w:proofErr w:type="gramEnd"/>
+      <w:r>
+        <w:t xml:space="preserve"> ALSO BE USED FOR ANY ADMIN SERVICES PROVIDED BY THE NONPROFIT MEDICAL DEBT REL COORD TO DISCHRGE MED DEBT</w:t>
       </w:r>
     </w:p>
     <w:p>
@@ -6075,6 +6359,7 @@
         </w:numPr>
       </w:pPr>
       <w:r>
+        <w:lastRenderedPageBreak/>
         <w:t>IL STUDENT ASSISTANCE COMM</w:t>
       </w:r>
     </w:p>
@@ -6366,11 +6651,11 @@
         <w:t>TRUST FUND TO BE HELD OUTSIDE THE STATE TREASURY,</w:t>
       </w:r>
       <w:r>
-        <w:t xml:space="preserve"> WITH THE STATE TREASURER AS CUSTODIAN. THE COMMISSION MAY ACCEPT MONETARY GIFTS AND GRANTS FROM ANY PUBLIC OR PRIVATE SOURCE, WHICH SHALL BE HELD IN THE FUND. ALL GIFTS, GRANTS, ASSETS, FUNDS, OR MONEY RECEIVED BY THE COMMISSION UNDER THIS ACT SHALL BE DEPOSITED AND HELD IN THE FUND BY THE STATE TREASURER AS EX OFFICIO CUSTODIAN SEPARATE AND APART FROM ALL PUBLIC MONEY OR </w:t>
+        <w:t xml:space="preserve"> WITH THE STATE TREASURER AS CUSTODIAN. THE COMMISSION MAY ACCEPT MONETARY GIFTS AND GRANTS FROM ANY PUBLIC </w:t>
       </w:r>
       <w:r>
         <w:lastRenderedPageBreak/>
-        <w:t>FUNDS OF THIS STATE AND SHALL BE ADMINISTERED BY THE COMMISSION EXCLUSIVELY FOR THE PURPSES SET FORTH IN THIS ACT.</w:t>
+        <w:t>OR PRIVATE SOURCE, WHICH SHALL BE HELD IN THE FUND. ALL GIFTS, GRANTS, ASSETS, FUNDS, OR MONEY RECEIVED BY THE COMMISSION UNDER THIS ACT SHALL BE DEPOSITED AND HELD IN THE FUND BY THE STATE TREASURER AS EX OFFICIO CUSTODIAN SEPARATE AND APART FROM ALL PUBLIC MONEY OR FUNDS OF THIS STATE AND SHALL BE ADMINISTERED BY THE COMMISSION EXCLUSIVELY FOR THE PURPSES SET FORTH IN THIS ACT.</w:t>
       </w:r>
     </w:p>
     <w:p>
@@ -6434,7 +6719,23 @@
           <w:i/>
           <w:iCs/>
         </w:rPr>
-        <w:t xml:space="preserve">Added this code of new and reused funds to the code-cleaning.qmd file: </w:t>
+        <w:t>Added this code of new and reused funds to the code-</w:t>
+      </w:r>
+      <w:proofErr w:type="spellStart"/>
+      <w:r>
+        <w:rPr>
+          <w:i/>
+          <w:iCs/>
+        </w:rPr>
+        <w:t>cleaning.qmd</w:t>
+      </w:r>
+      <w:proofErr w:type="spellEnd"/>
+      <w:r>
+        <w:rPr>
+          <w:i/>
+          <w:iCs/>
+        </w:rPr>
+        <w:t xml:space="preserve"> file: </w:t>
       </w:r>
     </w:p>
     <w:p>
@@ -6464,7 +6765,114 @@
           <w:i/>
           <w:iCs/>
         </w:rPr>
-        <w:t xml:space="preserve">  mutate(fund = ifelse(fy &lt; 2025 &amp; fund %in% c("0213", "0235", "0280", "0321", "0456", "0486", "0487", "0507"), str_replace(fund,"0", "9"), as.character(fund)),   </w:t>
+        <w:t xml:space="preserve">  </w:t>
+      </w:r>
+      <w:proofErr w:type="gramStart"/>
+      <w:r>
+        <w:rPr>
+          <w:i/>
+          <w:iCs/>
+        </w:rPr>
+        <w:t>mutate(</w:t>
+      </w:r>
+      <w:proofErr w:type="gramEnd"/>
+      <w:r>
+        <w:rPr>
+          <w:i/>
+          <w:iCs/>
+        </w:rPr>
+        <w:t xml:space="preserve">fund = </w:t>
+      </w:r>
+      <w:proofErr w:type="gramStart"/>
+      <w:r>
+        <w:rPr>
+          <w:i/>
+          <w:iCs/>
+        </w:rPr>
+        <w:t>ifelse(</w:t>
+      </w:r>
+      <w:proofErr w:type="spellStart"/>
+      <w:proofErr w:type="gramEnd"/>
+      <w:r>
+        <w:rPr>
+          <w:i/>
+          <w:iCs/>
+        </w:rPr>
+        <w:t>fy</w:t>
+      </w:r>
+      <w:proofErr w:type="spellEnd"/>
+      <w:r>
+        <w:rPr>
+          <w:i/>
+          <w:iCs/>
+        </w:rPr>
+        <w:t xml:space="preserve"> &lt; 2025 &amp; fund %in% </w:t>
+      </w:r>
+      <w:proofErr w:type="gramStart"/>
+      <w:r>
+        <w:rPr>
+          <w:i/>
+          <w:iCs/>
+        </w:rPr>
+        <w:t>c(</w:t>
+      </w:r>
+      <w:proofErr w:type="gramEnd"/>
+      <w:r>
+        <w:rPr>
+          <w:i/>
+          <w:iCs/>
+        </w:rPr>
+        <w:t xml:space="preserve">"0213", "0235", "0280", "0321", "0456", "0486", "0487", "0507"), </w:t>
+      </w:r>
+      <w:proofErr w:type="spellStart"/>
+      <w:r>
+        <w:rPr>
+          <w:i/>
+          <w:iCs/>
+        </w:rPr>
+        <w:t>str_</w:t>
+      </w:r>
+      <w:proofErr w:type="gramStart"/>
+      <w:r>
+        <w:rPr>
+          <w:i/>
+          <w:iCs/>
+        </w:rPr>
+        <w:t>replace</w:t>
+      </w:r>
+      <w:proofErr w:type="spellEnd"/>
+      <w:r>
+        <w:rPr>
+          <w:i/>
+          <w:iCs/>
+        </w:rPr>
+        <w:t>(</w:t>
+      </w:r>
+      <w:proofErr w:type="gramEnd"/>
+      <w:r>
+        <w:rPr>
+          <w:i/>
+          <w:iCs/>
+        </w:rPr>
+        <w:t xml:space="preserve">fund,"0", "9"), </w:t>
+      </w:r>
+      <w:proofErr w:type="spellStart"/>
+      <w:proofErr w:type="gramStart"/>
+      <w:r>
+        <w:rPr>
+          <w:i/>
+          <w:iCs/>
+        </w:rPr>
+        <w:t>as.character</w:t>
+      </w:r>
+      <w:proofErr w:type="spellEnd"/>
+      <w:proofErr w:type="gramEnd"/>
+      <w:r>
+        <w:rPr>
+          <w:i/>
+          <w:iCs/>
+        </w:rPr>
+        <w:t xml:space="preserve">(fund)),   </w:t>
       </w:r>
     </w:p>
     <w:p>
@@ -6479,7 +6887,66 @@
           <w:i/>
           <w:iCs/>
         </w:rPr>
-        <w:t xml:space="preserve">         fund = ifelse(fy &lt; 2025 &amp; fund == "0253", "10253", as.character(fund), # fund reused for 3rd time)  </w:t>
+        <w:t xml:space="preserve">         fund = </w:t>
+      </w:r>
+      <w:proofErr w:type="gramStart"/>
+      <w:r>
+        <w:rPr>
+          <w:i/>
+          <w:iCs/>
+        </w:rPr>
+        <w:t>ifelse(</w:t>
+      </w:r>
+      <w:proofErr w:type="spellStart"/>
+      <w:proofErr w:type="gramEnd"/>
+      <w:r>
+        <w:rPr>
+          <w:i/>
+          <w:iCs/>
+        </w:rPr>
+        <w:t>fy</w:t>
+      </w:r>
+      <w:proofErr w:type="spellEnd"/>
+      <w:r>
+        <w:rPr>
+          <w:i/>
+          <w:iCs/>
+        </w:rPr>
+        <w:t xml:space="preserve"> &lt; 2025 &amp; fund == "0253", "10253", </w:t>
+      </w:r>
+      <w:proofErr w:type="spellStart"/>
+      <w:proofErr w:type="gramStart"/>
+      <w:r>
+        <w:rPr>
+          <w:i/>
+          <w:iCs/>
+        </w:rPr>
+        <w:t>as.character</w:t>
+      </w:r>
+      <w:proofErr w:type="spellEnd"/>
+      <w:proofErr w:type="gramEnd"/>
+      <w:r>
+        <w:rPr>
+          <w:i/>
+          <w:iCs/>
+        </w:rPr>
+        <w:t>(fund</w:t>
+      </w:r>
+      <w:proofErr w:type="gramStart"/>
+      <w:r>
+        <w:rPr>
+          <w:i/>
+          <w:iCs/>
+        </w:rPr>
+        <w:t>), #</w:t>
+      </w:r>
+      <w:proofErr w:type="gramEnd"/>
+      <w:r>
+        <w:rPr>
+          <w:i/>
+          <w:iCs/>
+        </w:rPr>
+        <w:t xml:space="preserve"> fund reused for 3rd time)  </w:t>
       </w:r>
     </w:p>
     <w:p>
@@ -6494,7 +6961,66 @@
           <w:i/>
           <w:iCs/>
         </w:rPr>
-        <w:t xml:space="preserve">         fund = ifelse(fy &lt; 2025 &amp; fund == "0526", "10526", as.character(fund)  ) # fund reused for 3rd time)  </w:t>
+        <w:t xml:space="preserve">         fund = </w:t>
+      </w:r>
+      <w:proofErr w:type="gramStart"/>
+      <w:r>
+        <w:rPr>
+          <w:i/>
+          <w:iCs/>
+        </w:rPr>
+        <w:t>ifelse(</w:t>
+      </w:r>
+      <w:proofErr w:type="spellStart"/>
+      <w:proofErr w:type="gramEnd"/>
+      <w:r>
+        <w:rPr>
+          <w:i/>
+          <w:iCs/>
+        </w:rPr>
+        <w:t>fy</w:t>
+      </w:r>
+      <w:proofErr w:type="spellEnd"/>
+      <w:r>
+        <w:rPr>
+          <w:i/>
+          <w:iCs/>
+        </w:rPr>
+        <w:t xml:space="preserve"> &lt; 2025 &amp; fund == "0526", "10526", </w:t>
+      </w:r>
+      <w:proofErr w:type="spellStart"/>
+      <w:proofErr w:type="gramStart"/>
+      <w:r>
+        <w:rPr>
+          <w:i/>
+          <w:iCs/>
+        </w:rPr>
+        <w:t>as.character</w:t>
+      </w:r>
+      <w:proofErr w:type="spellEnd"/>
+      <w:proofErr w:type="gramEnd"/>
+      <w:r>
+        <w:rPr>
+          <w:i/>
+          <w:iCs/>
+        </w:rPr>
+        <w:t>(</w:t>
+      </w:r>
+      <w:proofErr w:type="gramStart"/>
+      <w:r>
+        <w:rPr>
+          <w:i/>
+          <w:iCs/>
+        </w:rPr>
+        <w:t>fund)  )</w:t>
+      </w:r>
+      <w:proofErr w:type="gramEnd"/>
+      <w:r>
+        <w:rPr>
+          <w:i/>
+          <w:iCs/>
+        </w:rPr>
+        <w:t xml:space="preserve"> # fund reused for 3rd time)  </w:t>
       </w:r>
     </w:p>
     <w:p>
@@ -8079,6 +8605,7 @@
   <w:style w:type="character" w:default="1" w:styleId="DefaultParagraphFont">
     <w:name w:val="Default Paragraph Font"/>
     <w:uiPriority w:val="1"/>
+    <w:semiHidden/>
     <w:unhideWhenUsed/>
   </w:style>
   <w:style w:type="table" w:default="1" w:styleId="TableNormal">

</xml_diff>